<commit_message>
docs(finance): align manuals and sdd with consolidated receipts
</commit_message>
<xml_diff>
--- a/docs/Manual_Entrega_Nomina_Docente.docx
+++ b/docs/Manual_Entrega_Nomina_Docente.docx
@@ -104,7 +104,7 @@
                 <w:color w:val="334155"/>
                 <w:sz w:val="19"/>
               </w:rPr>
-              <w:t>1.0 productiva</w:t>
+              <w:t>1.3 ajuste Finanzas</w:t>
             </w:r>
           </w:p>
         </w:tc>
@@ -171,7 +171,7 @@
                 <w:color w:val="334155"/>
                 <w:sz w:val="19"/>
               </w:rPr>
-              <w:t>8 de mayo de 2026</w:t>
+              <w:t>Actualización: 27 de octubre de 2026. Original: 8 de mayo de 2026.</w:t>
             </w:r>
           </w:p>
         </w:tc>
@@ -850,7 +850,7 @@
           <w:color w:val="334155"/>
           <w:sz w:val="18"/>
         </w:rPr>
-        <w:t>• PDF de comprobantes de pago en efectivo.</w:t>
+        <w:t>• PDF de comprobantes de pago en efectivo consolidados por docente y nómina guardada, incluidos extras, sin coordinación.</w:t>
       </w:r>
     </w:p>
     <w:p>
@@ -2257,63 +2257,7 @@
           <w:color w:val="334155"/>
           <w:sz w:val="18"/>
         </w:rPr>
-        <w:t>Estado productivo verificado el 2026-09-01: revisión Cloud Run</w:t>
-      </w:r>
-    </w:p>
-    <w:p>
-      <w:pPr>
-        <w:spacing w:after="100"/>
-      </w:pPr>
-      <w:r>
-        <w:rPr>
-          <w:rFonts w:ascii="Aptos" w:hAnsi="Aptos"/>
-          <w:b w:val="0"/>
-          <w:color w:val="334155"/>
-          <w:sz w:val="18"/>
-        </w:rPr>
-        <w:t>nomina-api-00055-8wn, imagen h23-prod-9268d42, digest</w:t>
-      </w:r>
-    </w:p>
-    <w:p>
-      <w:pPr>
-        <w:spacing w:after="100"/>
-      </w:pPr>
-      <w:r>
-        <w:rPr>
-          <w:rFonts w:ascii="Aptos" w:hAnsi="Aptos"/>
-          <w:b w:val="0"/>
-          <w:color w:val="334155"/>
-          <w:sz w:val="18"/>
-        </w:rPr>
-        <w:t>sha256:2e6dcf48aa54669c12a3efbf738737297434a528ba9e8040d9b7fa8638130e92,</w:t>
-      </w:r>
-    </w:p>
-    <w:p>
-      <w:pPr>
-        <w:spacing w:after="100"/>
-      </w:pPr>
-      <w:r>
-        <w:rPr>
-          <w:rFonts w:ascii="Aptos" w:hAnsi="Aptos"/>
-          <w:b w:val="0"/>
-          <w:color w:val="334155"/>
-          <w:sz w:val="18"/>
-        </w:rPr>
-        <w:t>Firebase Hosting release 1787419305880000 y version</w:t>
-      </w:r>
-    </w:p>
-    <w:p>
-      <w:pPr>
-        <w:spacing w:after="100"/>
-      </w:pPr>
-      <w:r>
-        <w:rPr>
-          <w:rFonts w:ascii="Aptos" w:hAnsi="Aptos"/>
-          <w:b w:val="0"/>
-          <w:color w:val="334155"/>
-          <w:sz w:val="18"/>
-        </w:rPr>
-        <w:t>07924eeeb7713f30.</w:t>
+        <w:t>Estado productivo documentado en el cierre del 2026-10-27: revisión Cloud Run nomina-api-00057-c7d, imagen finance-b3f40ce, digest sha256:a7d0de2196c5552d50cd75b8f01e15238dc90f701941b8656613bf6d1789196b, Firebase Hosting release 1793121624438000 y versión 3f9ebc88c835a143. El PDF consolidado y los nombres por rol tienen smoke productivo aprobado por el usuario. Fuente: docs/auditoria/H03_Deploy_Finanzas_Comprobantes_Consolidados.md; esta revisión documental no realiza nuevas consultas productivas.</w:t>
       </w:r>
     </w:p>
     <w:p>
@@ -3616,7 +3560,7 @@
                 <w:color w:val="334155"/>
                 <w:sz w:val="16"/>
               </w:rPr>
-              <w:t>Consulta global de Directorio; edición por teachers.created_by; operación por alcance/capturador; preview H20 de docentes propios o compartidos sin finalización ni datos fiscales</w:t>
+              <w:t>Consulta global de Directorio; edición por teachers.created_by; operación por alcance/capturador; preview H20 sin finalización ni fiscal; Finanzas de sus coordinaciones con nombres y solo lectura</w:t>
             </w:r>
           </w:p>
         </w:tc>
@@ -3684,7 +3628,7 @@
                 <w:color w:val="334155"/>
                 <w:sz w:val="16"/>
               </w:rPr>
-              <w:t>Consulta global de Nómina y Reportes; sin finalización ni workflow financiero; edición de Extras solo propios cuando aplica</w:t>
+              <w:t>Consulta global de Nómina, Reportes y Finanzas con nombres; sin finalización ni workflow financiero; edición de Extras solo propios cuando aplica</w:t>
             </w:r>
           </w:p>
         </w:tc>
@@ -4796,6 +4740,142 @@
                 <w:sz w:val="16"/>
               </w:rPr>
               <w:t>Ver Finanzas de todas las coordinaciones en modo consulta</w:t>
+            </w:r>
+          </w:p>
+        </w:tc>
+      </w:tr>
+      <w:tr>
+        <w:tc>
+          <w:tcPr>
+            <w:tcW w:type="dxa" w:w="5156"/>
+            <w:vAlign w:val="center"/>
+            <w:tcMar>
+              <w:top w:w="110" w:type="dxa"/>
+              <w:start w:w="120" w:type="dxa"/>
+              <w:bottom w:w="110" w:type="dxa"/>
+              <w:end w:w="120" w:type="dxa"/>
+            </w:tcMar>
+            <w:tcBorders>
+              <w:top w:val="single" w:sz="4" w:space="0" w:color="B7D4CC"/>
+              <w:left w:val="single" w:sz="4" w:space="0" w:color="B7D4CC"/>
+              <w:bottom w:val="single" w:sz="4" w:space="0" w:color="B7D4CC"/>
+              <w:right w:val="single" w:sz="4" w:space="0" w:color="B7D4CC"/>
+            </w:tcBorders>
+          </w:tcPr>
+          <w:p>
+            <w:pPr>
+              <w:spacing w:after="0"/>
+              <w:jc w:val="center"/>
+            </w:pPr>
+            <w:r>
+              <w:rPr>
+                <w:rFonts w:ascii="Aptos" w:hAnsi="Aptos"/>
+                <w:b w:val="0"/>
+                <w:color w:val="334155"/>
+                <w:sz w:val="16"/>
+              </w:rPr>
+              <w:t>finance.export</w:t>
+            </w:r>
+          </w:p>
+        </w:tc>
+        <w:tc>
+          <w:tcPr>
+            <w:tcW w:type="dxa" w:w="5156"/>
+            <w:vAlign w:val="center"/>
+            <w:tcMar>
+              <w:top w:w="110" w:type="dxa"/>
+              <w:start w:w="120" w:type="dxa"/>
+              <w:bottom w:w="110" w:type="dxa"/>
+              <w:end w:w="120" w:type="dxa"/>
+            </w:tcMar>
+            <w:tcBorders>
+              <w:top w:val="single" w:sz="4" w:space="0" w:color="B7D4CC"/>
+              <w:left w:val="single" w:sz="4" w:space="0" w:color="B7D4CC"/>
+              <w:bottom w:val="single" w:sz="4" w:space="0" w:color="B7D4CC"/>
+              <w:right w:val="single" w:sz="4" w:space="0" w:color="B7D4CC"/>
+            </w:tcBorders>
+          </w:tcPr>
+          <w:p>
+            <w:pPr>
+              <w:spacing w:after="0"/>
+              <w:jc w:val="left"/>
+            </w:pPr>
+            <w:r>
+              <w:rPr>
+                <w:rFonts w:ascii="Aptos" w:hAnsi="Aptos"/>
+                <w:b w:val="0"/>
+                <w:color w:val="334155"/>
+                <w:sz w:val="16"/>
+              </w:rPr>
+              <w:t>Exportaciones financieras autorizadas; no habilita workflow ni datos fiscales por sí solo</w:t>
+            </w:r>
+          </w:p>
+        </w:tc>
+      </w:tr>
+      <w:tr>
+        <w:tc>
+          <w:tcPr>
+            <w:tcW w:type="dxa" w:w="5156"/>
+            <w:vAlign w:val="center"/>
+            <w:tcMar>
+              <w:top w:w="110" w:type="dxa"/>
+              <w:start w:w="120" w:type="dxa"/>
+              <w:bottom w:w="110" w:type="dxa"/>
+              <w:end w:w="120" w:type="dxa"/>
+            </w:tcMar>
+            <w:tcBorders>
+              <w:top w:val="single" w:sz="4" w:space="0" w:color="B7D4CC"/>
+              <w:left w:val="single" w:sz="4" w:space="0" w:color="B7D4CC"/>
+              <w:bottom w:val="single" w:sz="4" w:space="0" w:color="B7D4CC"/>
+              <w:right w:val="single" w:sz="4" w:space="0" w:color="B7D4CC"/>
+            </w:tcBorders>
+          </w:tcPr>
+          <w:p>
+            <w:pPr>
+              <w:spacing w:after="0"/>
+              <w:jc w:val="center"/>
+            </w:pPr>
+            <w:r>
+              <w:rPr>
+                <w:rFonts w:ascii="Aptos" w:hAnsi="Aptos"/>
+                <w:b w:val="0"/>
+                <w:color w:val="334155"/>
+                <w:sz w:val="16"/>
+              </w:rPr>
+              <w:t>finance.workflow</w:t>
+            </w:r>
+          </w:p>
+        </w:tc>
+        <w:tc>
+          <w:tcPr>
+            <w:tcW w:type="dxa" w:w="5156"/>
+            <w:vAlign w:val="center"/>
+            <w:tcMar>
+              <w:top w:w="110" w:type="dxa"/>
+              <w:start w:w="120" w:type="dxa"/>
+              <w:bottom w:w="110" w:type="dxa"/>
+              <w:end w:w="120" w:type="dxa"/>
+            </w:tcMar>
+            <w:tcBorders>
+              <w:top w:val="single" w:sz="4" w:space="0" w:color="B7D4CC"/>
+              <w:left w:val="single" w:sz="4" w:space="0" w:color="B7D4CC"/>
+              <w:bottom w:val="single" w:sz="4" w:space="0" w:color="B7D4CC"/>
+              <w:right w:val="single" w:sz="4" w:space="0" w:color="B7D4CC"/>
+            </w:tcBorders>
+          </w:tcPr>
+          <w:p>
+            <w:pPr>
+              <w:spacing w:after="0"/>
+              <w:jc w:val="left"/>
+            </w:pPr>
+            <w:r>
+              <w:rPr>
+                <w:rFonts w:ascii="Aptos" w:hAnsi="Aptos"/>
+                <w:b w:val="0"/>
+                <w:color w:val="334155"/>
+                <w:sz w:val="16"/>
+              </w:rPr>
+              <w:t>Cambiar estados financieros permitidos; no permite cancelar una nómina PAGADA</w:t>
             </w:r>
           </w:p>
         </w:tc>
@@ -11470,6 +11550,657 @@
           <w:color w:val="334155"/>
           <w:sz w:val="18"/>
         </w:rPr>
+        <w:t>La identidad del docente no depende de permisos fiscales: el nombre se muestra a todos los roles autorizados dentro de su alcance. El RFC no sustituye al nombre. RFC, correo fiscal, datos bancarios y constancias mantienen sus controles específicos.</w:t>
+      </w:r>
+    </w:p>
+    <w:tbl>
+      <w:tblPr>
+        <w:tblW w:type="auto" w:w="0"/>
+        <w:jc w:val="center"/>
+        <w:tblLayout w:type="autofit"/>
+        <w:tblLook w:firstColumn="1" w:firstRow="1" w:lastColumn="0" w:lastRow="0" w:noHBand="0" w:noVBand="1" w:val="04A0"/>
+      </w:tblPr>
+      <w:tblGrid>
+        <w:gridCol w:w="3437"/>
+        <w:gridCol w:w="3437"/>
+        <w:gridCol w:w="3437"/>
+      </w:tblGrid>
+      <w:tr>
+        <w:tc>
+          <w:tcPr>
+            <w:tcW w:type="dxa" w:w="3437"/>
+            <w:vAlign w:val="center"/>
+            <w:tcMar>
+              <w:top w:w="110" w:type="dxa"/>
+              <w:start w:w="120" w:type="dxa"/>
+              <w:bottom w:w="110" w:type="dxa"/>
+              <w:end w:w="120" w:type="dxa"/>
+            </w:tcMar>
+            <w:tcBorders>
+              <w:top w:val="single" w:sz="4" w:space="0" w:color="B7D4CC"/>
+              <w:left w:val="single" w:sz="4" w:space="0" w:color="B7D4CC"/>
+              <w:bottom w:val="single" w:sz="4" w:space="0" w:color="B7D4CC"/>
+              <w:right w:val="single" w:sz="4" w:space="0" w:color="B7D4CC"/>
+            </w:tcBorders>
+            <w:shd w:fill="DDEFEA"/>
+          </w:tcPr>
+          <w:p>
+            <w:pPr>
+              <w:spacing w:after="0"/>
+              <w:jc w:val="center"/>
+            </w:pPr>
+            <w:r>
+              <w:rPr>
+                <w:rFonts w:ascii="Aptos" w:hAnsi="Aptos"/>
+                <w:b/>
+                <w:color w:val="0F172A"/>
+                <w:sz w:val="16"/>
+              </w:rPr>
+              <w:t>Rol</w:t>
+            </w:r>
+          </w:p>
+        </w:tc>
+        <w:tc>
+          <w:tcPr>
+            <w:tcW w:type="dxa" w:w="3437"/>
+            <w:vAlign w:val="center"/>
+            <w:tcMar>
+              <w:top w:w="110" w:type="dxa"/>
+              <w:start w:w="120" w:type="dxa"/>
+              <w:bottom w:w="110" w:type="dxa"/>
+              <w:end w:w="120" w:type="dxa"/>
+            </w:tcMar>
+            <w:tcBorders>
+              <w:top w:val="single" w:sz="4" w:space="0" w:color="B7D4CC"/>
+              <w:left w:val="single" w:sz="4" w:space="0" w:color="B7D4CC"/>
+              <w:bottom w:val="single" w:sz="4" w:space="0" w:color="B7D4CC"/>
+              <w:right w:val="single" w:sz="4" w:space="0" w:color="B7D4CC"/>
+            </w:tcBorders>
+            <w:shd w:fill="DDEFEA"/>
+          </w:tcPr>
+          <w:p>
+            <w:pPr>
+              <w:spacing w:after="0"/>
+              <w:jc w:val="left"/>
+            </w:pPr>
+            <w:r>
+              <w:rPr>
+                <w:rFonts w:ascii="Aptos" w:hAnsi="Aptos"/>
+                <w:b/>
+                <w:color w:val="0F172A"/>
+                <w:sz w:val="16"/>
+              </w:rPr>
+              <w:t>Alcance de Finanzas y nombres</w:t>
+            </w:r>
+          </w:p>
+        </w:tc>
+        <w:tc>
+          <w:tcPr>
+            <w:tcW w:type="dxa" w:w="3437"/>
+            <w:vAlign w:val="center"/>
+            <w:tcMar>
+              <w:top w:w="110" w:type="dxa"/>
+              <w:start w:w="120" w:type="dxa"/>
+              <w:bottom w:w="110" w:type="dxa"/>
+              <w:end w:w="120" w:type="dxa"/>
+            </w:tcMar>
+            <w:tcBorders>
+              <w:top w:val="single" w:sz="4" w:space="0" w:color="B7D4CC"/>
+              <w:left w:val="single" w:sz="4" w:space="0" w:color="B7D4CC"/>
+              <w:bottom w:val="single" w:sz="4" w:space="0" w:color="B7D4CC"/>
+              <w:right w:val="single" w:sz="4" w:space="0" w:color="B7D4CC"/>
+            </w:tcBorders>
+            <w:shd w:fill="DDEFEA"/>
+          </w:tcPr>
+          <w:p>
+            <w:pPr>
+              <w:spacing w:after="0"/>
+              <w:jc w:val="left"/>
+            </w:pPr>
+            <w:r>
+              <w:rPr>
+                <w:rFonts w:ascii="Aptos" w:hAnsi="Aptos"/>
+                <w:b/>
+                <w:color w:val="0F172A"/>
+                <w:sz w:val="16"/>
+              </w:rPr>
+              <w:t>Acciones y restricciones</w:t>
+            </w:r>
+          </w:p>
+        </w:tc>
+      </w:tr>
+      <w:tr>
+        <w:tc>
+          <w:tcPr>
+            <w:tcW w:type="dxa" w:w="3437"/>
+            <w:vAlign w:val="center"/>
+            <w:tcMar>
+              <w:top w:w="110" w:type="dxa"/>
+              <w:start w:w="120" w:type="dxa"/>
+              <w:bottom w:w="110" w:type="dxa"/>
+              <w:end w:w="120" w:type="dxa"/>
+            </w:tcMar>
+            <w:tcBorders>
+              <w:top w:val="single" w:sz="4" w:space="0" w:color="B7D4CC"/>
+              <w:left w:val="single" w:sz="4" w:space="0" w:color="B7D4CC"/>
+              <w:bottom w:val="single" w:sz="4" w:space="0" w:color="B7D4CC"/>
+              <w:right w:val="single" w:sz="4" w:space="0" w:color="B7D4CC"/>
+            </w:tcBorders>
+          </w:tcPr>
+          <w:p>
+            <w:pPr>
+              <w:spacing w:after="0"/>
+              <w:jc w:val="center"/>
+            </w:pPr>
+            <w:r>
+              <w:rPr>
+                <w:rFonts w:ascii="Aptos" w:hAnsi="Aptos"/>
+                <w:b w:val="0"/>
+                <w:color w:val="334155"/>
+                <w:sz w:val="16"/>
+              </w:rPr>
+              <w:t>Admin</w:t>
+            </w:r>
+          </w:p>
+        </w:tc>
+        <w:tc>
+          <w:tcPr>
+            <w:tcW w:type="dxa" w:w="3437"/>
+            <w:vAlign w:val="center"/>
+            <w:tcMar>
+              <w:top w:w="110" w:type="dxa"/>
+              <w:start w:w="120" w:type="dxa"/>
+              <w:bottom w:w="110" w:type="dxa"/>
+              <w:end w:w="120" w:type="dxa"/>
+            </w:tcMar>
+            <w:tcBorders>
+              <w:top w:val="single" w:sz="4" w:space="0" w:color="B7D4CC"/>
+              <w:left w:val="single" w:sz="4" w:space="0" w:color="B7D4CC"/>
+              <w:bottom w:val="single" w:sz="4" w:space="0" w:color="B7D4CC"/>
+              <w:right w:val="single" w:sz="4" w:space="0" w:color="B7D4CC"/>
+            </w:tcBorders>
+          </w:tcPr>
+          <w:p>
+            <w:pPr>
+              <w:spacing w:after="0"/>
+              <w:jc w:val="center"/>
+            </w:pPr>
+            <w:r>
+              <w:rPr>
+                <w:rFonts w:ascii="Aptos" w:hAnsi="Aptos"/>
+                <w:b w:val="0"/>
+                <w:color w:val="334155"/>
+                <w:sz w:val="16"/>
+              </w:rPr>
+              <w:t>Global</w:t>
+            </w:r>
+          </w:p>
+        </w:tc>
+        <w:tc>
+          <w:tcPr>
+            <w:tcW w:type="dxa" w:w="3437"/>
+            <w:vAlign w:val="center"/>
+            <w:tcMar>
+              <w:top w:w="110" w:type="dxa"/>
+              <w:start w:w="120" w:type="dxa"/>
+              <w:bottom w:w="110" w:type="dxa"/>
+              <w:end w:w="120" w:type="dxa"/>
+            </w:tcMar>
+            <w:tcBorders>
+              <w:top w:val="single" w:sz="4" w:space="0" w:color="B7D4CC"/>
+              <w:left w:val="single" w:sz="4" w:space="0" w:color="B7D4CC"/>
+              <w:bottom w:val="single" w:sz="4" w:space="0" w:color="B7D4CC"/>
+              <w:right w:val="single" w:sz="4" w:space="0" w:color="B7D4CC"/>
+            </w:tcBorders>
+          </w:tcPr>
+          <w:p>
+            <w:pPr>
+              <w:spacing w:after="0"/>
+              <w:jc w:val="left"/>
+            </w:pPr>
+            <w:r>
+              <w:rPr>
+                <w:rFonts w:ascii="Aptos" w:hAnsi="Aptos"/>
+                <w:b w:val="0"/>
+                <w:color w:val="334155"/>
+                <w:sz w:val="16"/>
+              </w:rPr>
+              <w:t>Conserva exportaciones y controles administrativos</w:t>
+            </w:r>
+          </w:p>
+        </w:tc>
+      </w:tr>
+      <w:tr>
+        <w:tc>
+          <w:tcPr>
+            <w:tcW w:type="dxa" w:w="3437"/>
+            <w:vAlign w:val="center"/>
+            <w:tcMar>
+              <w:top w:w="110" w:type="dxa"/>
+              <w:start w:w="120" w:type="dxa"/>
+              <w:bottom w:w="110" w:type="dxa"/>
+              <w:end w:w="120" w:type="dxa"/>
+            </w:tcMar>
+            <w:tcBorders>
+              <w:top w:val="single" w:sz="4" w:space="0" w:color="B7D4CC"/>
+              <w:left w:val="single" w:sz="4" w:space="0" w:color="B7D4CC"/>
+              <w:bottom w:val="single" w:sz="4" w:space="0" w:color="B7D4CC"/>
+              <w:right w:val="single" w:sz="4" w:space="0" w:color="B7D4CC"/>
+            </w:tcBorders>
+          </w:tcPr>
+          <w:p>
+            <w:pPr>
+              <w:spacing w:after="0"/>
+              <w:jc w:val="center"/>
+            </w:pPr>
+            <w:r>
+              <w:rPr>
+                <w:rFonts w:ascii="Aptos" w:hAnsi="Aptos"/>
+                <w:b w:val="0"/>
+                <w:color w:val="334155"/>
+                <w:sz w:val="16"/>
+              </w:rPr>
+              <w:t>Coordinador</w:t>
+            </w:r>
+          </w:p>
+        </w:tc>
+        <w:tc>
+          <w:tcPr>
+            <w:tcW w:type="dxa" w:w="3437"/>
+            <w:vAlign w:val="center"/>
+            <w:tcMar>
+              <w:top w:w="110" w:type="dxa"/>
+              <w:start w:w="120" w:type="dxa"/>
+              <w:bottom w:w="110" w:type="dxa"/>
+              <w:end w:w="120" w:type="dxa"/>
+            </w:tcMar>
+            <w:tcBorders>
+              <w:top w:val="single" w:sz="4" w:space="0" w:color="B7D4CC"/>
+              <w:left w:val="single" w:sz="4" w:space="0" w:color="B7D4CC"/>
+              <w:bottom w:val="single" w:sz="4" w:space="0" w:color="B7D4CC"/>
+              <w:right w:val="single" w:sz="4" w:space="0" w:color="B7D4CC"/>
+            </w:tcBorders>
+          </w:tcPr>
+          <w:p>
+            <w:pPr>
+              <w:spacing w:after="0"/>
+              <w:jc w:val="left"/>
+            </w:pPr>
+            <w:r>
+              <w:rPr>
+                <w:rFonts w:ascii="Aptos" w:hAnsi="Aptos"/>
+                <w:b w:val="0"/>
+                <w:color w:val="334155"/>
+                <w:sz w:val="16"/>
+              </w:rPr>
+              <w:t>Líneas de sus coordinaciones activas en actorCoordinations[]; no ve corridas sin líneas en alcance</w:t>
+            </w:r>
+          </w:p>
+        </w:tc>
+        <w:tc>
+          <w:tcPr>
+            <w:tcW w:type="dxa" w:w="3437"/>
+            <w:vAlign w:val="center"/>
+            <w:tcMar>
+              <w:top w:w="110" w:type="dxa"/>
+              <w:start w:w="120" w:type="dxa"/>
+              <w:bottom w:w="110" w:type="dxa"/>
+              <w:end w:w="120" w:type="dxa"/>
+            </w:tcMar>
+            <w:tcBorders>
+              <w:top w:val="single" w:sz="4" w:space="0" w:color="B7D4CC"/>
+              <w:left w:val="single" w:sz="4" w:space="0" w:color="B7D4CC"/>
+              <w:bottom w:val="single" w:sz="4" w:space="0" w:color="B7D4CC"/>
+              <w:right w:val="single" w:sz="4" w:space="0" w:color="B7D4CC"/>
+            </w:tcBorders>
+          </w:tcPr>
+          <w:p>
+            <w:pPr>
+              <w:spacing w:after="0"/>
+              <w:jc w:val="left"/>
+            </w:pPr>
+            <w:r>
+              <w:rPr>
+                <w:rFonts w:ascii="Aptos" w:hAnsi="Aptos"/>
+                <w:b w:val="0"/>
+                <w:color w:val="334155"/>
+                <w:sz w:val="16"/>
+              </w:rPr>
+              <w:t>Solo lectura; sin exportación, workflow, guardado ni datos fiscales</w:t>
+            </w:r>
+          </w:p>
+        </w:tc>
+      </w:tr>
+      <w:tr>
+        <w:tc>
+          <w:tcPr>
+            <w:tcW w:type="dxa" w:w="3437"/>
+            <w:vAlign w:val="center"/>
+            <w:tcMar>
+              <w:top w:w="110" w:type="dxa"/>
+              <w:start w:w="120" w:type="dxa"/>
+              <w:bottom w:w="110" w:type="dxa"/>
+              <w:end w:w="120" w:type="dxa"/>
+            </w:tcMar>
+            <w:tcBorders>
+              <w:top w:val="single" w:sz="4" w:space="0" w:color="B7D4CC"/>
+              <w:left w:val="single" w:sz="4" w:space="0" w:color="B7D4CC"/>
+              <w:bottom w:val="single" w:sz="4" w:space="0" w:color="B7D4CC"/>
+              <w:right w:val="single" w:sz="4" w:space="0" w:color="B7D4CC"/>
+            </w:tcBorders>
+          </w:tcPr>
+          <w:p>
+            <w:pPr>
+              <w:spacing w:after="0"/>
+              <w:jc w:val="left"/>
+            </w:pPr>
+            <w:r>
+              <w:rPr>
+                <w:rFonts w:ascii="Aptos" w:hAnsi="Aptos"/>
+                <w:b w:val="0"/>
+                <w:color w:val="334155"/>
+                <w:sz w:val="16"/>
+              </w:rPr>
+              <w:t>Dirección/Subdirección</w:t>
+            </w:r>
+          </w:p>
+        </w:tc>
+        <w:tc>
+          <w:tcPr>
+            <w:tcW w:type="dxa" w:w="3437"/>
+            <w:vAlign w:val="center"/>
+            <w:tcMar>
+              <w:top w:w="110" w:type="dxa"/>
+              <w:start w:w="120" w:type="dxa"/>
+              <w:bottom w:w="110" w:type="dxa"/>
+              <w:end w:w="120" w:type="dxa"/>
+            </w:tcMar>
+            <w:tcBorders>
+              <w:top w:val="single" w:sz="4" w:space="0" w:color="B7D4CC"/>
+              <w:left w:val="single" w:sz="4" w:space="0" w:color="B7D4CC"/>
+              <w:bottom w:val="single" w:sz="4" w:space="0" w:color="B7D4CC"/>
+              <w:right w:val="single" w:sz="4" w:space="0" w:color="B7D4CC"/>
+            </w:tcBorders>
+          </w:tcPr>
+          <w:p>
+            <w:pPr>
+              <w:spacing w:after="0"/>
+              <w:jc w:val="center"/>
+            </w:pPr>
+            <w:r>
+              <w:rPr>
+                <w:rFonts w:ascii="Aptos" w:hAnsi="Aptos"/>
+                <w:b w:val="0"/>
+                <w:color w:val="334155"/>
+                <w:sz w:val="16"/>
+              </w:rPr>
+              <w:t>Global con nombres</w:t>
+            </w:r>
+          </w:p>
+        </w:tc>
+        <w:tc>
+          <w:tcPr>
+            <w:tcW w:type="dxa" w:w="3437"/>
+            <w:vAlign w:val="center"/>
+            <w:tcMar>
+              <w:top w:w="110" w:type="dxa"/>
+              <w:start w:w="120" w:type="dxa"/>
+              <w:bottom w:w="110" w:type="dxa"/>
+              <w:end w:w="120" w:type="dxa"/>
+            </w:tcMar>
+            <w:tcBorders>
+              <w:top w:val="single" w:sz="4" w:space="0" w:color="B7D4CC"/>
+              <w:left w:val="single" w:sz="4" w:space="0" w:color="B7D4CC"/>
+              <w:bottom w:val="single" w:sz="4" w:space="0" w:color="B7D4CC"/>
+              <w:right w:val="single" w:sz="4" w:space="0" w:color="B7D4CC"/>
+            </w:tcBorders>
+          </w:tcPr>
+          <w:p>
+            <w:pPr>
+              <w:spacing w:after="0"/>
+              <w:jc w:val="left"/>
+            </w:pPr>
+            <w:r>
+              <w:rPr>
+                <w:rFonts w:ascii="Aptos" w:hAnsi="Aptos"/>
+                <w:b w:val="0"/>
+                <w:color w:val="334155"/>
+                <w:sz w:val="16"/>
+              </w:rPr>
+              <w:t>Solo consulta y PDF por coordinaciones autorizado; sin workflow ni fiscal sensible</w:t>
+            </w:r>
+          </w:p>
+        </w:tc>
+      </w:tr>
+      <w:tr>
+        <w:tc>
+          <w:tcPr>
+            <w:tcW w:type="dxa" w:w="3437"/>
+            <w:vAlign w:val="center"/>
+            <w:tcMar>
+              <w:top w:w="110" w:type="dxa"/>
+              <w:start w:w="120" w:type="dxa"/>
+              <w:bottom w:w="110" w:type="dxa"/>
+              <w:end w:w="120" w:type="dxa"/>
+            </w:tcMar>
+            <w:tcBorders>
+              <w:top w:val="single" w:sz="4" w:space="0" w:color="B7D4CC"/>
+              <w:left w:val="single" w:sz="4" w:space="0" w:color="B7D4CC"/>
+              <w:bottom w:val="single" w:sz="4" w:space="0" w:color="B7D4CC"/>
+              <w:right w:val="single" w:sz="4" w:space="0" w:color="B7D4CC"/>
+            </w:tcBorders>
+          </w:tcPr>
+          <w:p>
+            <w:pPr>
+              <w:spacing w:after="0"/>
+              <w:jc w:val="center"/>
+            </w:pPr>
+            <w:r>
+              <w:rPr>
+                <w:rFonts w:ascii="Aptos" w:hAnsi="Aptos"/>
+                <w:b w:val="0"/>
+                <w:color w:val="334155"/>
+                <w:sz w:val="16"/>
+              </w:rPr>
+              <w:t>Finanzas</w:t>
+            </w:r>
+          </w:p>
+        </w:tc>
+        <w:tc>
+          <w:tcPr>
+            <w:tcW w:type="dxa" w:w="3437"/>
+            <w:vAlign w:val="center"/>
+            <w:tcMar>
+              <w:top w:w="110" w:type="dxa"/>
+              <w:start w:w="120" w:type="dxa"/>
+              <w:bottom w:w="110" w:type="dxa"/>
+              <w:end w:w="120" w:type="dxa"/>
+            </w:tcMar>
+            <w:tcBorders>
+              <w:top w:val="single" w:sz="4" w:space="0" w:color="B7D4CC"/>
+              <w:left w:val="single" w:sz="4" w:space="0" w:color="B7D4CC"/>
+              <w:bottom w:val="single" w:sz="4" w:space="0" w:color="B7D4CC"/>
+              <w:right w:val="single" w:sz="4" w:space="0" w:color="B7D4CC"/>
+            </w:tcBorders>
+          </w:tcPr>
+          <w:p>
+            <w:pPr>
+              <w:spacing w:after="0"/>
+              <w:jc w:val="left"/>
+            </w:pPr>
+            <w:r>
+              <w:rPr>
+                <w:rFonts w:ascii="Aptos" w:hAnsi="Aptos"/>
+                <w:b w:val="0"/>
+                <w:color w:val="334155"/>
+                <w:sz w:val="16"/>
+              </w:rPr>
+              <w:t>Consulta con nombres según permisos vigentes</w:t>
+            </w:r>
+          </w:p>
+        </w:tc>
+        <w:tc>
+          <w:tcPr>
+            <w:tcW w:type="dxa" w:w="3437"/>
+            <w:vAlign w:val="center"/>
+            <w:tcMar>
+              <w:top w:w="110" w:type="dxa"/>
+              <w:start w:w="120" w:type="dxa"/>
+              <w:bottom w:w="110" w:type="dxa"/>
+              <w:end w:w="120" w:type="dxa"/>
+            </w:tcMar>
+            <w:tcBorders>
+              <w:top w:val="single" w:sz="4" w:space="0" w:color="B7D4CC"/>
+              <w:left w:val="single" w:sz="4" w:space="0" w:color="B7D4CC"/>
+              <w:bottom w:val="single" w:sz="4" w:space="0" w:color="B7D4CC"/>
+              <w:right w:val="single" w:sz="4" w:space="0" w:color="B7D4CC"/>
+            </w:tcBorders>
+          </w:tcPr>
+          <w:p>
+            <w:pPr>
+              <w:spacing w:after="0"/>
+              <w:jc w:val="left"/>
+            </w:pPr>
+            <w:r>
+              <w:rPr>
+                <w:rFonts w:ascii="Aptos" w:hAnsi="Aptos"/>
+                <w:b w:val="0"/>
+                <w:color w:val="334155"/>
+                <w:sz w:val="16"/>
+              </w:rPr>
+              <w:t>Exportación y workflow separados de fiscal/documentos</w:t>
+            </w:r>
+          </w:p>
+        </w:tc>
+      </w:tr>
+      <w:tr>
+        <w:tc>
+          <w:tcPr>
+            <w:tcW w:type="dxa" w:w="3437"/>
+            <w:vAlign w:val="center"/>
+            <w:tcMar>
+              <w:top w:w="110" w:type="dxa"/>
+              <w:start w:w="120" w:type="dxa"/>
+              <w:bottom w:w="110" w:type="dxa"/>
+              <w:end w:w="120" w:type="dxa"/>
+            </w:tcMar>
+            <w:tcBorders>
+              <w:top w:val="single" w:sz="4" w:space="0" w:color="B7D4CC"/>
+              <w:left w:val="single" w:sz="4" w:space="0" w:color="B7D4CC"/>
+              <w:bottom w:val="single" w:sz="4" w:space="0" w:color="B7D4CC"/>
+              <w:right w:val="single" w:sz="4" w:space="0" w:color="B7D4CC"/>
+            </w:tcBorders>
+          </w:tcPr>
+          <w:p>
+            <w:pPr>
+              <w:spacing w:after="0"/>
+              <w:jc w:val="left"/>
+            </w:pPr>
+            <w:r>
+              <w:rPr>
+                <w:rFonts w:ascii="Aptos" w:hAnsi="Aptos"/>
+                <w:b w:val="0"/>
+                <w:color w:val="334155"/>
+                <w:sz w:val="16"/>
+              </w:rPr>
+              <w:t>Contador/Contabilidad</w:t>
+            </w:r>
+          </w:p>
+        </w:tc>
+        <w:tc>
+          <w:tcPr>
+            <w:tcW w:type="dxa" w:w="3437"/>
+            <w:vAlign w:val="center"/>
+            <w:tcMar>
+              <w:top w:w="110" w:type="dxa"/>
+              <w:start w:w="120" w:type="dxa"/>
+              <w:bottom w:w="110" w:type="dxa"/>
+              <w:end w:w="120" w:type="dxa"/>
+            </w:tcMar>
+            <w:tcBorders>
+              <w:top w:val="single" w:sz="4" w:space="0" w:color="B7D4CC"/>
+              <w:left w:val="single" w:sz="4" w:space="0" w:color="B7D4CC"/>
+              <w:bottom w:val="single" w:sz="4" w:space="0" w:color="B7D4CC"/>
+              <w:right w:val="single" w:sz="4" w:space="0" w:color="B7D4CC"/>
+            </w:tcBorders>
+          </w:tcPr>
+          <w:p>
+            <w:pPr>
+              <w:spacing w:after="0"/>
+              <w:jc w:val="left"/>
+            </w:pPr>
+            <w:r>
+              <w:rPr>
+                <w:rFonts w:ascii="Aptos" w:hAnsi="Aptos"/>
+                <w:b w:val="0"/>
+                <w:color w:val="334155"/>
+                <w:sz w:val="16"/>
+              </w:rPr>
+              <w:t>Consulta con nombres y exportación autorizada</w:t>
+            </w:r>
+          </w:p>
+        </w:tc>
+        <w:tc>
+          <w:tcPr>
+            <w:tcW w:type="dxa" w:w="3437"/>
+            <w:vAlign w:val="center"/>
+            <w:tcMar>
+              <w:top w:w="110" w:type="dxa"/>
+              <w:start w:w="120" w:type="dxa"/>
+              <w:bottom w:w="110" w:type="dxa"/>
+              <w:end w:w="120" w:type="dxa"/>
+            </w:tcMar>
+            <w:tcBorders>
+              <w:top w:val="single" w:sz="4" w:space="0" w:color="B7D4CC"/>
+              <w:left w:val="single" w:sz="4" w:space="0" w:color="B7D4CC"/>
+              <w:bottom w:val="single" w:sz="4" w:space="0" w:color="B7D4CC"/>
+              <w:right w:val="single" w:sz="4" w:space="0" w:color="B7D4CC"/>
+            </w:tcBorders>
+          </w:tcPr>
+          <w:p>
+            <w:pPr>
+              <w:spacing w:after="0"/>
+              <w:jc w:val="left"/>
+            </w:pPr>
+            <w:r>
+              <w:rPr>
+                <w:rFonts w:ascii="Aptos" w:hAnsi="Aptos"/>
+                <w:b w:val="0"/>
+                <w:color w:val="334155"/>
+                <w:sz w:val="16"/>
+              </w:rPr>
+              <w:t>Sin workflow ni permisos fiscales implícitos</w:t>
+            </w:r>
+          </w:p>
+        </w:tc>
+      </w:tr>
+    </w:tbl>
+    <w:p/>
+    <w:p>
+      <w:pPr>
+        <w:spacing w:after="100"/>
+      </w:pPr>
+      <w:r>
+        <w:rPr>
+          <w:rFonts w:ascii="Aptos" w:hAnsi="Aptos"/>
+          <w:b w:val="0"/>
+          <w:color w:val="334155"/>
+          <w:sz w:val="18"/>
+        </w:rPr>
+        <w:t>El contexto financiero acepta permisos existentes de consulta, consulta global, exportación o payroll.preview; este último permite la lectura acotada de Coordinador. No se añadieron permisos persistidos mediante SQL. RH no obtiene acceso a Finanzas por el permiso fiscal solo. El alcance multicoordinación H20 del preview de Nómina no se extiende automáticamente a Finanzas.</w:t>
+      </w:r>
+    </w:p>
+    <w:p>
+      <w:pPr>
+        <w:spacing w:after="100"/>
+      </w:pPr>
+      <w:r>
+        <w:rPr>
+          <w:rFonts w:ascii="Aptos" w:hAnsi="Aptos"/>
+          <w:b w:val="0"/>
+          <w:color w:val="334155"/>
+          <w:sz w:val="18"/>
+        </w:rPr>
         <w:t>Incluye:</w:t>
       </w:r>
     </w:p>
@@ -12243,7 +12974,7 @@
           <w:color w:val="334155"/>
           <w:sz w:val="18"/>
         </w:rPr>
-        <w:t>El sistema genera comprobantes PDF para docentes con pago en efectivo. Cada comprobante contiene:</w:t>
+        <w:t>El sistema genera un solo comprobante por docente en la corrida guardada seleccionada. Agrupa por identidad del docente las líneas de pago en efectivo y suma sus totales guardados, incluidos los extras. No mezcla corridas ni incorpora líneas de pago bancario. Cada comprobante contiene:</w:t>
       </w:r>
     </w:p>
     <w:p>
@@ -12285,7 +13016,7 @@
           <w:color w:val="334155"/>
           <w:sz w:val="18"/>
         </w:rPr>
-        <w:t>• Coordinación.</w:t>
+        <w:t>• Monto total consolidado en efectivo.</w:t>
       </w:r>
     </w:p>
     <w:p>
@@ -12299,7 +13030,7 @@
           <w:color w:val="334155"/>
           <w:sz w:val="18"/>
         </w:rPr>
-        <w:t>• Monto pagado.</w:t>
+        <w:t>• Fecha de emisión.</w:t>
       </w:r>
     </w:p>
     <w:p>
@@ -12313,7 +13044,7 @@
           <w:color w:val="334155"/>
           <w:sz w:val="18"/>
         </w:rPr>
-        <w:t>• Fecha de emisión.</w:t>
+        <w:t>• Texto de conformidad.</w:t>
       </w:r>
     </w:p>
     <w:p>
@@ -12327,20 +13058,6 @@
           <w:color w:val="334155"/>
           <w:sz w:val="18"/>
         </w:rPr>
-        <w:t>• Texto de conformidad.</w:t>
-      </w:r>
-    </w:p>
-    <w:p>
-      <w:pPr>
-        <w:spacing w:after="40"/>
-      </w:pPr>
-      <w:r>
-        <w:rPr>
-          <w:rFonts w:ascii="Aptos" w:hAnsi="Aptos"/>
-          <w:b w:val="0"/>
-          <w:color w:val="334155"/>
-          <w:sz w:val="18"/>
-        </w:rPr>
         <w:t>• Espacio para firma.</w:t>
       </w:r>
     </w:p>
@@ -12356,6 +13073,48 @@
           <w:sz w:val="18"/>
         </w:rPr>
         <w:t>El formato está pensado para media carta: dos comprobantes por hoja tamaño carta.</w:t>
+      </w:r>
+    </w:p>
+    <w:p>
+      <w:pPr>
+        <w:spacing w:after="100"/>
+      </w:pPr>
+      <w:r>
+        <w:rPr>
+          <w:rFonts w:ascii="Aptos" w:hAnsi="Aptos"/>
+          <w:b w:val="0"/>
+          <w:color w:val="334155"/>
+          <w:sz w:val="18"/>
+        </w:rPr>
+        <w:t>El nombre de la coordinación se eliminó del comprobante; los reportes y desgloses por coordinación siguen disponibles conforme a los permisos existentes. El contador del resumen de efectivo representa docentes/comprobantes únicos, no líneas de nómina.</w:t>
+      </w:r>
+    </w:p>
+    <w:p>
+      <w:pPr>
+        <w:spacing w:after="100"/>
+      </w:pPr>
+      <w:r>
+        <w:rPr>
+          <w:rFonts w:ascii="Aptos" w:hAnsi="Aptos"/>
+          <w:b w:val="0"/>
+          <w:color w:val="334155"/>
+          <w:sz w:val="18"/>
+        </w:rPr>
+        <w:t>Implementación de consulta: filtrar payment_type_snapshot = 'E', agrupar por teacher_id y sumar total_amount de las líneas de la corrida seleccionada con los helpers decimales existentes. Los extras ya forman parte de esos totales y no se suman de nuevo. No se modifica calculatePayroll(), H01, redondeos, tabuladores, snapshots ni corridas históricas. Descargar el PDF no marca la corrida como PAGADA.</w:t>
+      </w:r>
+    </w:p>
+    <w:p>
+      <w:pPr>
+        <w:spacing w:after="100"/>
+      </w:pPr>
+      <w:r>
+        <w:rPr>
+          <w:rFonts w:ascii="Aptos" w:hAnsi="Aptos"/>
+          <w:b w:val="0"/>
+          <w:color w:val="334155"/>
+          <w:sz w:val="18"/>
+        </w:rPr>
+        <w:t>La descarga conserva finance.export y la restricción del modo de consulta global de Dirección/Subdirección. Mostrar nombres no concede exportación, acceso fiscal ni workflow. El ajuste está cerrado operativo con smoke productivo confirmado; referencia: docs/auditoria/H03_Deploy_Finanzas_Comprobantes_Consolidados.md.</w:t>
       </w:r>
     </w:p>
     <w:p>

</xml_diff>

<commit_message>
docs(h18): align manuals with post-H23 operational reports
</commit_message>
<xml_diff>
--- a/docs/Manual_Entrega_Nomina_Docente.docx
+++ b/docs/Manual_Entrega_Nomina_Docente.docx
@@ -104,7 +104,7 @@
                 <w:color w:val="334155"/>
                 <w:sz w:val="19"/>
               </w:rPr>
-              <w:t>1.3 ajuste Finanzas</w:t>
+              <w:t>1.4 Finanzas y Reportes post-H23</w:t>
             </w:r>
           </w:p>
         </w:tc>
@@ -3560,7 +3560,7 @@
                 <w:color w:val="334155"/>
                 <w:sz w:val="16"/>
               </w:rPr>
-              <w:t>Consulta global de Directorio; edición por teachers.created_by; operación por alcance/capturador; preview H20 sin finalización ni fiscal; Finanzas de sus coordinaciones con nombres y solo lectura</w:t>
+              <w:t>Consulta global de Directorio y ambas pestañas de Reportes; edición por teachers.created_by; operación por alcance/capturador; preview H20 sin finalización ni fiscal; Finanzas de sus coordinaciones con nombres y solo lectura</w:t>
             </w:r>
           </w:p>
         </w:tc>
@@ -3696,7 +3696,7 @@
                 <w:color w:val="334155"/>
                 <w:sz w:val="16"/>
               </w:rPr>
-              <w:t>Gestión global de expedientes fiscales y acceso autorizado a carga por categoría</w:t>
+              <w:t>Gestión global de expedientes fiscales; sin acceso a Reportes Operativos H18</w:t>
             </w:r>
           </w:p>
         </w:tc>
@@ -12868,79 +12868,632 @@
           <w:color w:val="334155"/>
           <w:sz w:val="18"/>
         </w:rPr>
-        <w:t>El módulo independiente /reports ofrece:</w:t>
-      </w:r>
-    </w:p>
-    <w:p>
-      <w:pPr>
-        <w:spacing w:after="40"/>
-      </w:pPr>
-      <w:r>
-        <w:rPr>
-          <w:rFonts w:ascii="Aptos" w:hAnsi="Aptos"/>
-          <w:b w:val="0"/>
-          <w:color w:val="334155"/>
-          <w:sz w:val="18"/>
-        </w:rPr>
-        <w:t>• Horas base y extras: disponible para Admin y Dirección/Subdirección.</w:t>
-      </w:r>
-    </w:p>
-    <w:p>
-      <w:pPr>
-        <w:spacing w:after="40"/>
-      </w:pPr>
-      <w:r>
-        <w:rPr>
-          <w:rFonts w:ascii="Aptos" w:hAnsi="Aptos"/>
-          <w:b w:val="0"/>
-          <w:color w:val="334155"/>
-          <w:sz w:val="18"/>
-        </w:rPr>
-        <w:t>• Horas base por categoría: disponible para Admin, Dirección/Subdirección, Coordinador y RH; Coordinador limitado a su alcance operativo.</w:t>
-      </w:r>
-    </w:p>
-    <w:p>
-      <w:pPr>
-        <w:spacing w:after="40"/>
-      </w:pPr>
-      <w:r>
-        <w:rPr>
-          <w:rFonts w:ascii="Aptos" w:hAnsi="Aptos"/>
-          <w:b w:val="0"/>
-          <w:color w:val="334155"/>
-          <w:sz w:val="18"/>
-        </w:rPr>
-        <w:t>• Filtros legibles por ciclo/quincena y búsqueda general, sin IDs técnicos visibles.</w:t>
-      </w:r>
-    </w:p>
-    <w:p>
-      <w:pPr>
-        <w:spacing w:after="40"/>
-      </w:pPr>
-      <w:r>
-        <w:rPr>
-          <w:rFonts w:ascii="Aptos" w:hAnsi="Aptos"/>
-          <w:b w:val="0"/>
-          <w:color w:val="334155"/>
-          <w:sz w:val="18"/>
-        </w:rPr>
-        <w:t>• Exportación CSV UTF-8 y XLSX real generado en API.</w:t>
-      </w:r>
-    </w:p>
-    <w:p>
-      <w:pPr>
-        <w:spacing w:after="40"/>
-      </w:pPr>
-      <w:r>
-        <w:rPr>
-          <w:rFonts w:ascii="Aptos" w:hAnsi="Aptos"/>
-          <w:b w:val="0"/>
-          <w:color w:val="334155"/>
-          <w:sz w:val="18"/>
-        </w:rPr>
-        <w:t>• Datos vivos o snapshots según exista una corrida guardada no cancelada.</w:t>
-      </w:r>
-    </w:p>
+        <w:t>El módulo independiente /reports incorpora el ajuste H18 post-H23 cerrado operativo. Admin, Dirección/Subdirección y Coordinador pueden consultar y exportar ambas pestañas globalmente, incluso docentes de otros capturadores. RH, Finanzas, Contador y Contabilidad están excluidos. Las guardas backend validan los roles; no se utiliza el alcance del Coordinador para recortar H18 ni se amplían permisos de captura, Finanzas o finalización de Nómina.</w:t>
+      </w:r>
+    </w:p>
+    <w:tbl>
+      <w:tblPr>
+        <w:tblW w:type="auto" w:w="0"/>
+        <w:jc w:val="center"/>
+        <w:tblLayout w:type="autofit"/>
+        <w:tblLook w:firstColumn="1" w:firstRow="1" w:lastColumn="0" w:lastRow="0" w:noHBand="0" w:noVBand="1" w:val="04A0"/>
+      </w:tblPr>
+      <w:tblGrid>
+        <w:gridCol w:w="3437"/>
+        <w:gridCol w:w="3437"/>
+        <w:gridCol w:w="3437"/>
+      </w:tblGrid>
+      <w:tr>
+        <w:tc>
+          <w:tcPr>
+            <w:tcW w:type="dxa" w:w="3437"/>
+            <w:vAlign w:val="center"/>
+            <w:tcMar>
+              <w:top w:w="110" w:type="dxa"/>
+              <w:start w:w="120" w:type="dxa"/>
+              <w:bottom w:w="110" w:type="dxa"/>
+              <w:end w:w="120" w:type="dxa"/>
+            </w:tcMar>
+            <w:tcBorders>
+              <w:top w:val="single" w:sz="4" w:space="0" w:color="B7D4CC"/>
+              <w:left w:val="single" w:sz="4" w:space="0" w:color="B7D4CC"/>
+              <w:bottom w:val="single" w:sz="4" w:space="0" w:color="B7D4CC"/>
+              <w:right w:val="single" w:sz="4" w:space="0" w:color="B7D4CC"/>
+            </w:tcBorders>
+            <w:shd w:fill="DDEFEA"/>
+          </w:tcPr>
+          <w:p>
+            <w:pPr>
+              <w:spacing w:after="0"/>
+              <w:jc w:val="center"/>
+            </w:pPr>
+            <w:r>
+              <w:rPr>
+                <w:rFonts w:ascii="Aptos" w:hAnsi="Aptos"/>
+                <w:b/>
+                <w:color w:val="0F172A"/>
+                <w:sz w:val="16"/>
+              </w:rPr>
+              <w:t>Aspecto</w:t>
+            </w:r>
+          </w:p>
+        </w:tc>
+        <w:tc>
+          <w:tcPr>
+            <w:tcW w:type="dxa" w:w="3437"/>
+            <w:vAlign w:val="center"/>
+            <w:tcMar>
+              <w:top w:w="110" w:type="dxa"/>
+              <w:start w:w="120" w:type="dxa"/>
+              <w:bottom w:w="110" w:type="dxa"/>
+              <w:end w:w="120" w:type="dxa"/>
+            </w:tcMar>
+            <w:tcBorders>
+              <w:top w:val="single" w:sz="4" w:space="0" w:color="B7D4CC"/>
+              <w:left w:val="single" w:sz="4" w:space="0" w:color="B7D4CC"/>
+              <w:bottom w:val="single" w:sz="4" w:space="0" w:color="B7D4CC"/>
+              <w:right w:val="single" w:sz="4" w:space="0" w:color="B7D4CC"/>
+            </w:tcBorders>
+            <w:shd w:fill="DDEFEA"/>
+          </w:tcPr>
+          <w:p>
+            <w:pPr>
+              <w:spacing w:after="0"/>
+              <w:jc w:val="left"/>
+            </w:pPr>
+            <w:r>
+              <w:rPr>
+                <w:rFonts w:ascii="Aptos" w:hAnsi="Aptos"/>
+                <w:b/>
+                <w:color w:val="0F172A"/>
+                <w:sz w:val="16"/>
+              </w:rPr>
+              <w:t>Horas base y extras</w:t>
+            </w:r>
+          </w:p>
+        </w:tc>
+        <w:tc>
+          <w:tcPr>
+            <w:tcW w:type="dxa" w:w="3437"/>
+            <w:vAlign w:val="center"/>
+            <w:tcMar>
+              <w:top w:w="110" w:type="dxa"/>
+              <w:start w:w="120" w:type="dxa"/>
+              <w:bottom w:w="110" w:type="dxa"/>
+              <w:end w:w="120" w:type="dxa"/>
+            </w:tcMar>
+            <w:tcBorders>
+              <w:top w:val="single" w:sz="4" w:space="0" w:color="B7D4CC"/>
+              <w:left w:val="single" w:sz="4" w:space="0" w:color="B7D4CC"/>
+              <w:bottom w:val="single" w:sz="4" w:space="0" w:color="B7D4CC"/>
+              <w:right w:val="single" w:sz="4" w:space="0" w:color="B7D4CC"/>
+            </w:tcBorders>
+            <w:shd w:fill="DDEFEA"/>
+          </w:tcPr>
+          <w:p>
+            <w:pPr>
+              <w:spacing w:after="0"/>
+              <w:jc w:val="left"/>
+            </w:pPr>
+            <w:r>
+              <w:rPr>
+                <w:rFonts w:ascii="Aptos" w:hAnsi="Aptos"/>
+                <w:b/>
+                <w:color w:val="0F172A"/>
+                <w:sz w:val="16"/>
+              </w:rPr>
+              <w:t>Horas base por categoría</w:t>
+            </w:r>
+          </w:p>
+        </w:tc>
+      </w:tr>
+      <w:tr>
+        <w:tc>
+          <w:tcPr>
+            <w:tcW w:type="dxa" w:w="3437"/>
+            <w:vAlign w:val="center"/>
+            <w:tcMar>
+              <w:top w:w="110" w:type="dxa"/>
+              <w:start w:w="120" w:type="dxa"/>
+              <w:bottom w:w="110" w:type="dxa"/>
+              <w:end w:w="120" w:type="dxa"/>
+            </w:tcMar>
+            <w:tcBorders>
+              <w:top w:val="single" w:sz="4" w:space="0" w:color="B7D4CC"/>
+              <w:left w:val="single" w:sz="4" w:space="0" w:color="B7D4CC"/>
+              <w:bottom w:val="single" w:sz="4" w:space="0" w:color="B7D4CC"/>
+              <w:right w:val="single" w:sz="4" w:space="0" w:color="B7D4CC"/>
+            </w:tcBorders>
+          </w:tcPr>
+          <w:p>
+            <w:pPr>
+              <w:spacing w:after="0"/>
+              <w:jc w:val="center"/>
+            </w:pPr>
+            <w:r>
+              <w:rPr>
+                <w:rFonts w:ascii="Aptos" w:hAnsi="Aptos"/>
+                <w:b w:val="0"/>
+                <w:color w:val="334155"/>
+                <w:sz w:val="16"/>
+              </w:rPr>
+              <w:t>Unidad</w:t>
+            </w:r>
+          </w:p>
+        </w:tc>
+        <w:tc>
+          <w:tcPr>
+            <w:tcW w:type="dxa" w:w="3437"/>
+            <w:vAlign w:val="center"/>
+            <w:tcMar>
+              <w:top w:w="110" w:type="dxa"/>
+              <w:start w:w="120" w:type="dxa"/>
+              <w:bottom w:w="110" w:type="dxa"/>
+              <w:end w:w="120" w:type="dxa"/>
+            </w:tcMar>
+            <w:tcBorders>
+              <w:top w:val="single" w:sz="4" w:space="0" w:color="B7D4CC"/>
+              <w:left w:val="single" w:sz="4" w:space="0" w:color="B7D4CC"/>
+              <w:bottom w:val="single" w:sz="4" w:space="0" w:color="B7D4CC"/>
+              <w:right w:val="single" w:sz="4" w:space="0" w:color="B7D4CC"/>
+            </w:tcBorders>
+          </w:tcPr>
+          <w:p>
+            <w:pPr>
+              <w:spacing w:after="0"/>
+              <w:jc w:val="left"/>
+            </w:pPr>
+            <w:r>
+              <w:rPr>
+                <w:rFonts w:ascii="Aptos" w:hAnsi="Aptos"/>
+                <w:b w:val="0"/>
+                <w:color w:val="334155"/>
+                <w:sz w:val="16"/>
+              </w:rPr>
+              <w:t>Quincena seleccionada</w:t>
+            </w:r>
+          </w:p>
+        </w:tc>
+        <w:tc>
+          <w:tcPr>
+            <w:tcW w:type="dxa" w:w="3437"/>
+            <w:vAlign w:val="center"/>
+            <w:tcMar>
+              <w:top w:w="110" w:type="dxa"/>
+              <w:start w:w="120" w:type="dxa"/>
+              <w:bottom w:w="110" w:type="dxa"/>
+              <w:end w:w="120" w:type="dxa"/>
+            </w:tcMar>
+            <w:tcBorders>
+              <w:top w:val="single" w:sz="4" w:space="0" w:color="B7D4CC"/>
+              <w:left w:val="single" w:sz="4" w:space="0" w:color="B7D4CC"/>
+              <w:bottom w:val="single" w:sz="4" w:space="0" w:color="B7D4CC"/>
+              <w:right w:val="single" w:sz="4" w:space="0" w:color="B7D4CC"/>
+            </w:tcBorders>
+          </w:tcPr>
+          <w:p>
+            <w:pPr>
+              <w:spacing w:after="0"/>
+              <w:jc w:val="left"/>
+            </w:pPr>
+            <w:r>
+              <w:rPr>
+                <w:rFonts w:ascii="Aptos" w:hAnsi="Aptos"/>
+                <w:b w:val="0"/>
+                <w:color w:val="334155"/>
+                <w:sz w:val="16"/>
+              </w:rPr>
+              <w:t>Carga semanal del ciclo seleccionado</w:t>
+            </w:r>
+          </w:p>
+        </w:tc>
+      </w:tr>
+      <w:tr>
+        <w:tc>
+          <w:tcPr>
+            <w:tcW w:type="dxa" w:w="3437"/>
+            <w:vAlign w:val="center"/>
+            <w:tcMar>
+              <w:top w:w="110" w:type="dxa"/>
+              <w:start w:w="120" w:type="dxa"/>
+              <w:bottom w:w="110" w:type="dxa"/>
+              <w:end w:w="120" w:type="dxa"/>
+            </w:tcMar>
+            <w:tcBorders>
+              <w:top w:val="single" w:sz="4" w:space="0" w:color="B7D4CC"/>
+              <w:left w:val="single" w:sz="4" w:space="0" w:color="B7D4CC"/>
+              <w:bottom w:val="single" w:sz="4" w:space="0" w:color="B7D4CC"/>
+              <w:right w:val="single" w:sz="4" w:space="0" w:color="B7D4CC"/>
+            </w:tcBorders>
+          </w:tcPr>
+          <w:p>
+            <w:pPr>
+              <w:spacing w:after="0"/>
+              <w:jc w:val="center"/>
+            </w:pPr>
+            <w:r>
+              <w:rPr>
+                <w:rFonts w:ascii="Aptos" w:hAnsi="Aptos"/>
+                <w:b w:val="0"/>
+                <w:color w:val="334155"/>
+                <w:sz w:val="16"/>
+              </w:rPr>
+              <w:t>Selección</w:t>
+            </w:r>
+          </w:p>
+        </w:tc>
+        <w:tc>
+          <w:tcPr>
+            <w:tcW w:type="dxa" w:w="3437"/>
+            <w:vAlign w:val="center"/>
+            <w:tcMar>
+              <w:top w:w="110" w:type="dxa"/>
+              <w:start w:w="120" w:type="dxa"/>
+              <w:bottom w:w="110" w:type="dxa"/>
+              <w:end w:w="120" w:type="dxa"/>
+            </w:tcMar>
+            <w:tcBorders>
+              <w:top w:val="single" w:sz="4" w:space="0" w:color="B7D4CC"/>
+              <w:left w:val="single" w:sz="4" w:space="0" w:color="B7D4CC"/>
+              <w:bottom w:val="single" w:sz="4" w:space="0" w:color="B7D4CC"/>
+              <w:right w:val="single" w:sz="4" w:space="0" w:color="B7D4CC"/>
+            </w:tcBorders>
+          </w:tcPr>
+          <w:p>
+            <w:pPr>
+              <w:spacing w:after="0"/>
+              <w:jc w:val="left"/>
+            </w:pPr>
+            <w:r>
+              <w:rPr>
+                <w:rFonts w:ascii="Aptos" w:hAnsi="Aptos"/>
+                <w:b w:val="0"/>
+                <w:color w:val="334155"/>
+                <w:sz w:val="16"/>
+              </w:rPr>
+              <w:t>Ciclo ACTIVO y quincena obligatorios; todos sus periodos configurados, con o sin corrida</w:t>
+            </w:r>
+          </w:p>
+        </w:tc>
+        <w:tc>
+          <w:tcPr>
+            <w:tcW w:type="dxa" w:w="3437"/>
+            <w:vAlign w:val="center"/>
+            <w:tcMar>
+              <w:top w:w="110" w:type="dxa"/>
+              <w:start w:w="120" w:type="dxa"/>
+              <w:bottom w:w="110" w:type="dxa"/>
+              <w:end w:w="120" w:type="dxa"/>
+            </w:tcMar>
+            <w:tcBorders>
+              <w:top w:val="single" w:sz="4" w:space="0" w:color="B7D4CC"/>
+              <w:left w:val="single" w:sz="4" w:space="0" w:color="B7D4CC"/>
+              <w:bottom w:val="single" w:sz="4" w:space="0" w:color="B7D4CC"/>
+              <w:right w:val="single" w:sz="4" w:space="0" w:color="B7D4CC"/>
+            </w:tcBorders>
+          </w:tcPr>
+          <w:p>
+            <w:pPr>
+              <w:spacing w:after="0"/>
+              <w:jc w:val="left"/>
+            </w:pPr>
+            <w:r>
+              <w:rPr>
+                <w:rFonts w:ascii="Aptos" w:hAnsi="Aptos"/>
+                <w:b w:val="0"/>
+                <w:color w:val="334155"/>
+                <w:sz w:val="16"/>
+              </w:rPr>
+              <w:t>Ciclo obligatorio; no requiere quincena</w:t>
+            </w:r>
+          </w:p>
+        </w:tc>
+      </w:tr>
+      <w:tr>
+        <w:tc>
+          <w:tcPr>
+            <w:tcW w:type="dxa" w:w="3437"/>
+            <w:vAlign w:val="center"/>
+            <w:tcMar>
+              <w:top w:w="110" w:type="dxa"/>
+              <w:start w:w="120" w:type="dxa"/>
+              <w:bottom w:w="110" w:type="dxa"/>
+              <w:end w:w="120" w:type="dxa"/>
+            </w:tcMar>
+            <w:tcBorders>
+              <w:top w:val="single" w:sz="4" w:space="0" w:color="B7D4CC"/>
+              <w:left w:val="single" w:sz="4" w:space="0" w:color="B7D4CC"/>
+              <w:bottom w:val="single" w:sz="4" w:space="0" w:color="B7D4CC"/>
+              <w:right w:val="single" w:sz="4" w:space="0" w:color="B7D4CC"/>
+            </w:tcBorders>
+          </w:tcPr>
+          <w:p>
+            <w:pPr>
+              <w:spacing w:after="0"/>
+              <w:jc w:val="center"/>
+            </w:pPr>
+            <w:r>
+              <w:rPr>
+                <w:rFonts w:ascii="Aptos" w:hAnsi="Aptos"/>
+                <w:b w:val="0"/>
+                <w:color w:val="334155"/>
+                <w:sz w:val="16"/>
+              </w:rPr>
+              <w:t>Fuente</w:t>
+            </w:r>
+          </w:p>
+        </w:tc>
+        <w:tc>
+          <w:tcPr>
+            <w:tcW w:type="dxa" w:w="3437"/>
+            <w:vAlign w:val="center"/>
+            <w:tcMar>
+              <w:top w:w="110" w:type="dxa"/>
+              <w:start w:w="120" w:type="dxa"/>
+              <w:bottom w:w="110" w:type="dxa"/>
+              <w:end w:w="120" w:type="dxa"/>
+            </w:tcMar>
+            <w:tcBorders>
+              <w:top w:val="single" w:sz="4" w:space="0" w:color="B7D4CC"/>
+              <w:left w:val="single" w:sz="4" w:space="0" w:color="B7D4CC"/>
+              <w:bottom w:val="single" w:sz="4" w:space="0" w:color="B7D4CC"/>
+              <w:right w:val="single" w:sz="4" w:space="0" w:color="B7D4CC"/>
+            </w:tcBorders>
+          </w:tcPr>
+          <w:p>
+            <w:pPr>
+              <w:spacing w:after="0"/>
+              <w:jc w:val="left"/>
+            </w:pPr>
+            <w:r>
+              <w:rPr>
+                <w:rFonts w:ascii="Aptos" w:hAnsi="Aptos"/>
+                <w:b w:val="0"/>
+                <w:color w:val="334155"/>
+                <w:sz w:val="16"/>
+              </w:rPr>
+              <w:t>source=auto: corrida no cancelada o cálculo vivo H23</w:t>
+            </w:r>
+          </w:p>
+        </w:tc>
+        <w:tc>
+          <w:tcPr>
+            <w:tcW w:type="dxa" w:w="3437"/>
+            <w:vAlign w:val="center"/>
+            <w:tcMar>
+              <w:top w:w="110" w:type="dxa"/>
+              <w:start w:w="120" w:type="dxa"/>
+              <w:bottom w:w="110" w:type="dxa"/>
+              <w:end w:w="120" w:type="dxa"/>
+            </w:tcMar>
+            <w:tcBorders>
+              <w:top w:val="single" w:sz="4" w:space="0" w:color="B7D4CC"/>
+              <w:left w:val="single" w:sz="4" w:space="0" w:color="B7D4CC"/>
+              <w:bottom w:val="single" w:sz="4" w:space="0" w:color="B7D4CC"/>
+              <w:right w:val="single" w:sz="4" w:space="0" w:color="B7D4CC"/>
+            </w:tcBorders>
+          </w:tcPr>
+          <w:p>
+            <w:pPr>
+              <w:spacing w:after="0"/>
+              <w:jc w:val="left"/>
+            </w:pPr>
+            <w:r>
+              <w:rPr>
+                <w:rFonts w:ascii="Aptos" w:hAnsi="Aptos"/>
+                <w:b w:val="0"/>
+                <w:color w:val="334155"/>
+                <w:sz w:val="16"/>
+              </w:rPr>
+              <w:t>Siempre horarios vivos; no snapshot</w:t>
+            </w:r>
+          </w:p>
+        </w:tc>
+      </w:tr>
+      <w:tr>
+        <w:tc>
+          <w:tcPr>
+            <w:tcW w:type="dxa" w:w="3437"/>
+            <w:vAlign w:val="center"/>
+            <w:tcMar>
+              <w:top w:w="110" w:type="dxa"/>
+              <w:start w:w="120" w:type="dxa"/>
+              <w:bottom w:w="110" w:type="dxa"/>
+              <w:end w:w="120" w:type="dxa"/>
+            </w:tcMar>
+            <w:tcBorders>
+              <w:top w:val="single" w:sz="4" w:space="0" w:color="B7D4CC"/>
+              <w:left w:val="single" w:sz="4" w:space="0" w:color="B7D4CC"/>
+              <w:bottom w:val="single" w:sz="4" w:space="0" w:color="B7D4CC"/>
+              <w:right w:val="single" w:sz="4" w:space="0" w:color="B7D4CC"/>
+            </w:tcBorders>
+          </w:tcPr>
+          <w:p>
+            <w:pPr>
+              <w:spacing w:after="0"/>
+              <w:jc w:val="center"/>
+            </w:pPr>
+            <w:r>
+              <w:rPr>
+                <w:rFonts w:ascii="Aptos" w:hAnsi="Aptos"/>
+                <w:b w:val="0"/>
+                <w:color w:val="334155"/>
+                <w:sz w:val="16"/>
+              </w:rPr>
+              <w:t>Comparación</w:t>
+            </w:r>
+          </w:p>
+        </w:tc>
+        <w:tc>
+          <w:tcPr>
+            <w:tcW w:type="dxa" w:w="3437"/>
+            <w:vAlign w:val="center"/>
+            <w:tcMar>
+              <w:top w:w="110" w:type="dxa"/>
+              <w:start w:w="120" w:type="dxa"/>
+              <w:bottom w:w="110" w:type="dxa"/>
+              <w:end w:w="120" w:type="dxa"/>
+            </w:tcMar>
+            <w:tcBorders>
+              <w:top w:val="single" w:sz="4" w:space="0" w:color="B7D4CC"/>
+              <w:left w:val="single" w:sz="4" w:space="0" w:color="B7D4CC"/>
+              <w:bottom w:val="single" w:sz="4" w:space="0" w:color="B7D4CC"/>
+              <w:right w:val="single" w:sz="4" w:space="0" w:color="B7D4CC"/>
+            </w:tcBorders>
+          </w:tcPr>
+          <w:p>
+            <w:pPr>
+              <w:spacing w:after="0"/>
+              <w:jc w:val="left"/>
+            </w:pPr>
+            <w:r>
+              <w:rPr>
+                <w:rFonts w:ascii="Aptos" w:hAnsi="Aptos"/>
+                <w:b w:val="0"/>
+                <w:color w:val="334155"/>
+                <w:sz w:val="16"/>
+              </w:rPr>
+              <w:t>Total real del docente contra V=70, M=50, N=30</w:t>
+            </w:r>
+          </w:p>
+        </w:tc>
+        <w:tc>
+          <w:tcPr>
+            <w:tcW w:type="dxa" w:w="3437"/>
+            <w:vAlign w:val="center"/>
+            <w:tcMar>
+              <w:top w:w="110" w:type="dxa"/>
+              <w:start w:w="120" w:type="dxa"/>
+              <w:bottom w:w="110" w:type="dxa"/>
+              <w:end w:w="120" w:type="dxa"/>
+            </w:tcMar>
+            <w:tcBorders>
+              <w:top w:val="single" w:sz="4" w:space="0" w:color="B7D4CC"/>
+              <w:left w:val="single" w:sz="4" w:space="0" w:color="B7D4CC"/>
+              <w:bottom w:val="single" w:sz="4" w:space="0" w:color="B7D4CC"/>
+              <w:right w:val="single" w:sz="4" w:space="0" w:color="B7D4CC"/>
+            </w:tcBorders>
+          </w:tcPr>
+          <w:p>
+            <w:pPr>
+              <w:spacing w:after="0"/>
+              <w:jc w:val="left"/>
+            </w:pPr>
+            <w:r>
+              <w:rPr>
+                <w:rFonts w:ascii="Aptos" w:hAnsi="Aptos"/>
+                <w:b w:val="0"/>
+                <w:color w:val="334155"/>
+                <w:sz w:val="16"/>
+              </w:rPr>
+              <w:t>Carga global del docente contra V=35, M=25, N=15</w:t>
+            </w:r>
+          </w:p>
+        </w:tc>
+      </w:tr>
+      <w:tr>
+        <w:tc>
+          <w:tcPr>
+            <w:tcW w:type="dxa" w:w="3437"/>
+            <w:vAlign w:val="center"/>
+            <w:tcMar>
+              <w:top w:w="110" w:type="dxa"/>
+              <w:start w:w="120" w:type="dxa"/>
+              <w:bottom w:w="110" w:type="dxa"/>
+              <w:end w:w="120" w:type="dxa"/>
+            </w:tcMar>
+            <w:tcBorders>
+              <w:top w:val="single" w:sz="4" w:space="0" w:color="B7D4CC"/>
+              <w:left w:val="single" w:sz="4" w:space="0" w:color="B7D4CC"/>
+              <w:bottom w:val="single" w:sz="4" w:space="0" w:color="B7D4CC"/>
+              <w:right w:val="single" w:sz="4" w:space="0" w:color="B7D4CC"/>
+            </w:tcBorders>
+          </w:tcPr>
+          <w:p>
+            <w:pPr>
+              <w:spacing w:after="0"/>
+              <w:jc w:val="center"/>
+            </w:pPr>
+            <w:r>
+              <w:rPr>
+                <w:rFonts w:ascii="Aptos" w:hAnsi="Aptos"/>
+                <w:b w:val="0"/>
+                <w:color w:val="334155"/>
+                <w:sz w:val="16"/>
+              </w:rPr>
+              <w:t>Resultado</w:t>
+            </w:r>
+          </w:p>
+        </w:tc>
+        <w:tc>
+          <w:tcPr>
+            <w:tcW w:type="dxa" w:w="3437"/>
+            <w:vAlign w:val="center"/>
+            <w:tcMar>
+              <w:top w:w="110" w:type="dxa"/>
+              <w:start w:w="120" w:type="dxa"/>
+              <w:bottom w:w="110" w:type="dxa"/>
+              <w:end w:w="120" w:type="dxa"/>
+            </w:tcMar>
+            <w:tcBorders>
+              <w:top w:val="single" w:sz="4" w:space="0" w:color="B7D4CC"/>
+              <w:left w:val="single" w:sz="4" w:space="0" w:color="B7D4CC"/>
+              <w:bottom w:val="single" w:sz="4" w:space="0" w:color="B7D4CC"/>
+              <w:right w:val="single" w:sz="4" w:space="0" w:color="B7D4CC"/>
+            </w:tcBorders>
+          </w:tcPr>
+          <w:p>
+            <w:pPr>
+              <w:spacing w:after="0"/>
+              <w:jc w:val="left"/>
+            </w:pPr>
+            <w:r>
+              <w:rPr>
+                <w:rFonts w:ascii="Aptos" w:hAnsi="Aptos"/>
+                <w:b w:val="0"/>
+                <w:color w:val="334155"/>
+                <w:sz w:val="16"/>
+              </w:rPr>
+              <w:t>Desglose por coordinación, descuentos, extras y sobrecarga informativa</w:t>
+            </w:r>
+          </w:p>
+        </w:tc>
+        <w:tc>
+          <w:tcPr>
+            <w:tcW w:type="dxa" w:w="3437"/>
+            <w:vAlign w:val="center"/>
+            <w:tcMar>
+              <w:top w:w="110" w:type="dxa"/>
+              <w:start w:w="120" w:type="dxa"/>
+              <w:bottom w:w="110" w:type="dxa"/>
+              <w:end w:w="120" w:type="dxa"/>
+            </w:tcMar>
+            <w:tcBorders>
+              <w:top w:val="single" w:sz="4" w:space="0" w:color="B7D4CC"/>
+              <w:left w:val="single" w:sz="4" w:space="0" w:color="B7D4CC"/>
+              <w:bottom w:val="single" w:sz="4" w:space="0" w:color="B7D4CC"/>
+              <w:right w:val="single" w:sz="4" w:space="0" w:color="B7D4CC"/>
+            </w:tcBorders>
+          </w:tcPr>
+          <w:p>
+            <w:pPr>
+              <w:spacing w:after="0"/>
+              <w:jc w:val="left"/>
+            </w:pPr>
+            <w:r>
+              <w:rPr>
+                <w:rFonts w:ascii="Aptos" w:hAnsi="Aptos"/>
+                <w:b w:val="0"/>
+                <w:color w:val="334155"/>
+                <w:sz w:val="16"/>
+              </w:rPr>
+              <w:t>Una fila por docente con estado y desglose por coordinación</w:t>
+            </w:r>
+          </w:p>
+        </w:tc>
+      </w:tr>
+    </w:tbl>
+    <w:p/>
     <w:p>
       <w:pPr>
         <w:spacing w:after="100"/>
@@ -12952,7 +13505,77 @@
           <w:color w:val="334155"/>
           <w:sz w:val="18"/>
         </w:rPr>
-        <w:t>No expone RFC, banco, cuenta, CLABE, paymentType ni constancias.</w:t>
+        <w:t>Base y extras. La consulta viva calcula ocurrencias de horarios elegibles dentro de la quincena y de la vigencia base del ciclo, con M1/M2 para S1/S2 y días inhábiles según H23. Requiere vigencia base configurada. No hay consulta viva del ciclo sin quincena. Los extras independientes conservan su elegibilidad por fecha de quincena y no se limitan por la vigencia base.</w:t>
+      </w:r>
+    </w:p>
+    <w:p>
+      <w:pPr>
+        <w:spacing w:after="100"/>
+      </w:pPr>
+      <w:r>
+        <w:rPr>
+          <w:rFonts w:ascii="Aptos" w:hAnsi="Aptos"/>
+          <w:b w:val="0"/>
+          <w:color w:val="334155"/>
+          <w:sz w:val="18"/>
+        </w:rPr>
+        <w:t>El cálculo informativo consolidado por docente es: base_neta = max(base_bruta - faltas - retardos * 0.5, 0) y total_real = base_neta + extras_incidencia + extras_externos. Se marca sobrecarga solo cuando excede el límite quincenal de su categoría. Se muestran también coordinación, responsable de horario, capturadores disponibles, motivo y fecha. El total del docente puede repetirse en filas de desglose y no debe sumarse nuevamente. Se obtiene sobre las filas devueltas por los filtros; para evaluar su carga completa, no deben excluirse coordinaciones o tipos de filas del docente.</w:t>
+      </w:r>
+    </w:p>
+    <w:p>
+      <w:pPr>
+        <w:spacing w:after="100"/>
+      </w:pPr>
+      <w:r>
+        <w:rPr>
+          <w:rFonts w:ascii="Aptos" w:hAnsi="Aptos"/>
+          <w:b w:val="0"/>
+          <w:color w:val="334155"/>
+          <w:sz w:val="18"/>
+        </w:rPr>
+        <w:t>Cuando existe una corrida no cancelada, se usa la más reciente de esa quincena y se leen sus snapshots sin recalcularlos ni reescribirlos. El responsable del horario se resuelve mediante la relación actual con schedules.created_by, no mediante un snapshot inmutable independiente. Los capturadores de incidencia/extra no disponibles en la proyección guardada se muestran vacíos, no se inventan.</w:t>
+      </w:r>
+    </w:p>
+    <w:p>
+      <w:pPr>
+        <w:spacing w:after="100"/>
+      </w:pPr>
+      <w:r>
+        <w:rPr>
+          <w:rFonts w:ascii="Aptos" w:hAnsi="Aptos"/>
+          <w:b w:val="0"/>
+          <w:color w:val="334155"/>
+          <w:sz w:val="18"/>
+        </w:rPr>
+        <w:t>Categoría. Se suma globalmente por docente L-V, L-V + S1 y L-V + S2, y se toma GREATEST como carga asignada semanal. Restante = esperadas menos asignadas. Igualdad produce completo, menor carga faltante y mayor carga excedido. El umbral se aplica una sola vez; las coordinaciones son desglose y no se suman sus máximos individuales para sustituir el máximo global. No es un cálculo quincenal pagable ni descuenta incidencias o incorpora extras.</w:t>
+      </w:r>
+    </w:p>
+    <w:p>
+      <w:pPr>
+        <w:spacing w:after="100"/>
+      </w:pPr>
+      <w:r>
+        <w:rPr>
+          <w:rFonts w:ascii="Aptos" w:hAnsi="Aptos"/>
+          <w:b w:val="0"/>
+          <w:color w:val="334155"/>
+          <w:sz w:val="18"/>
+        </w:rPr>
+        <w:t>Ambas pestañas excluyen docentes inactivos y sin horarios. La primera ofrece filtros de ciclo, quincena, búsqueda general, categoría y tipo de extras; la segunda ciclo, búsqueda general, categoría y estado de carga. La UI usa nombres legibles, no IDs ni un selector técnico de origen. CSV UTF-8 con BOM/CRLF (H11) y XLSX server-side con exceljs reciben los mismos filtros actuales; conviene volver a consultar antes de exportar si se cambiaron filtros.</w:t>
+      </w:r>
+    </w:p>
+    <w:p>
+      <w:pPr>
+        <w:spacing w:after="100"/>
+      </w:pPr>
+      <w:r>
+        <w:rPr>
+          <w:rFonts w:ascii="Aptos" w:hAnsi="Aptos"/>
+          <w:b w:val="0"/>
+          <w:color w:val="334155"/>
+          <w:sz w:val="18"/>
+        </w:rPr>
+        <w:t>No expone RFC, banco, cuenta, CLABE, paymentType ni constancias. No modifica H01, importes, snapshots, corridas ni ventanas administrativas. Fuentes: docs/auditoria/H18_Ajuste_PostH23_Reportes_Operativos.md y docs/auditoria/H18_Deploy_PostH23_Reportes_Operativos.md. El smoke productivo aprobado en esa acta es evidencia previa, no una nueva prueba productiva de esta revisión documental.</w:t>
       </w:r>
     </w:p>
     <w:p>

</xml_diff>